<commit_message>
Funzioni: 4 assegnazioni per casa in progressione, con risoluzioni dettagliate per gruppi
- Un file .docx per assegnazione: consegna divisa in gruppi per tipologia
  e risoluzioni dettagliate passo per passo, un gruppo per pagina
- Progressione: prima gli argomenti che non richiedono le disequazioni
  (immagini, grafici, pari/dispari, composte, inversa), poi il ripasso delle
  disequazioni di 1° e 2° grado e fratte, quindi dominio, segno e riepilogo
- Aggiunti gli esercizi di ripasso R13 e R14 (disequazioni fratte)
- Raccolta docente allineata al nuovo piano (colonna Ass. con gruppo);
  rimossa la vecchia scheda consegne, sostituita dai 4 file

Co-Authored-By: Claude Opus 5.5 <noreply@anthropic.com>
Claude-Session: https://claude.ai/code/session_01K678cWtnp7X6aAn8gLfvWH
</commit_message>
<xml_diff>
--- a/Funzioni_Esercizi_per_casa_Soluzioni_4L.docx
+++ b/Funzioni_Esercizi_per_casa_Soluzioni_4L.docx
@@ -22,7 +22,7 @@
         <w:spacing w:after="40" w:before="0"/>
       </w:pPr>
       <w:r>
-        <w:t xml:space="preserve">Esercizi per casa con risultati e risoluzioni – versione per il docente</w:t>
+        <w:t xml:space="preserve">Raccolta di esercizi con risultati e risoluzioni brevi – versione per il docente</w:t>
       </w:r>
     </w:p>
     <w:p>
@@ -92,7 +92,7 @@
         <w:t xml:space="preserve">4 assegnazioni per casa</w:t>
       </w:r>
       <w:r>
-        <w:t xml:space="preserve"> (una per lezione) che portano al compito.</w:t>
+        <w:t xml:space="preserve"> che portano al compito.</w:t>
       </w:r>
     </w:p>
     <w:p>
@@ -110,7 +110,7 @@
         <w:t xml:space="preserve">Ass.</w:t>
       </w:r>
       <w:r>
-        <w:t xml:space="preserve">: A1–A4 = assegnazione in cui l’esercizio è obbligatorio; con l’asterisco (A1*) = facoltativo; «—» = esercizio di riserva.</w:t>
+        <w:t xml:space="preserve">: assegnazione e gruppo (es. A2-C = assegnazione 2, gruppo C); con l’asterisco (A3*) = facoltativo; «—» = esercizio di riserva.</w:t>
       </w:r>
     </w:p>
     <w:p>
@@ -118,7 +118,7 @@
         <w:spacing w:after="160" w:before="0"/>
       </w:pPr>
       <w:r>
-        <w:t xml:space="preserve">Gli esercizi svolti nell’eserciziario sono diversi da quelli assegnati: gli studenti hanno un modello, ma devono rifare il ragionamento da soli.</w:t>
+        <w:t xml:space="preserve">Le 4 assegnazioni, con le risoluzioni dettagliate per gruppi, sono nei file «Funzioni_Assegnazione_1…4». Gli esercizi svolti dell’eserciziario sono diversi da quelli assegnati.</w:t>
       </w:r>
     </w:p>
     <w:p>
@@ -144,10 +144,10 @@
           <w:b/>
           <w:bCs/>
         </w:rPr>
-        <w:t xml:space="preserve">Il compito decide le priorità.</w:t>
+        <w:t xml:space="preserve">Progressione per argomenti.</w:t>
       </w:r>
       <w:r>
-        <w:t xml:space="preserve"> Più spazio al dominio (due assegnazioni su quattro): è il cuore del compito e costringe a usare le disequazioni di 1° e 2° grado e fratte.</w:t>
+        <w:t xml:space="preserve"> Si parte da ciò che non richiede le disequazioni (immagini, lettura dei grafici, pari e dispari, composte, inversa); poi si ripassano le disequazioni (1° e 2° grado, quindi fratte); solo dopo dominio, segno e riepilogo.</w:t>
       </w:r>
     </w:p>
     <w:p>
@@ -163,10 +163,10 @@
           <w:b/>
           <w:bCs/>
         </w:rPr>
-        <w:t xml:space="preserve">Si assegna solo ciò che è stato fatto in classe.</w:t>
+        <w:t xml:space="preserve">Gruppi per tipologia.</w:t>
       </w:r>
       <w:r>
-        <w:t xml:space="preserve"> Ogni assegnazione segue la lezione in cui si è spiegato il metodo e mostrato l’esercizio svolto dello stesso tipo (eserciziario).</w:t>
+        <w:t xml:space="preserve"> Ogni assegnazione è divisa in gruppi (A, B, C, …), uno per tipo di esercizio, nell’ordine in cui vanno svolti. La correzione in classe e la consegna delle risoluzioni dettagliate si fanno gruppo per gruppo.</w:t>
       </w:r>
     </w:p>
     <w:p>
@@ -182,20 +182,10 @@
           <w:b/>
           <w:bCs/>
         </w:rPr>
-        <w:t xml:space="preserve">Carico costante: 12 esercizi obbligatori</w:t>
+        <w:t xml:space="preserve">Si assegna solo ciò che è stato fatto in classe</w:t>
       </w:r>
       <w:r>
-        <w:t xml:space="preserve"> (circa un’ora di lavoro) più 2–3 </w:t>
-      </w:r>
-      <w:r>
-        <w:rPr>
-          <w:b/>
-          <w:bCs/>
-        </w:rPr>
-        <w:t xml:space="preserve">facoltativi</w:t>
-      </w:r>
-      <w:r>
-        <w:t xml:space="preserve"> di livello ★★★ per chi è più sicuro.</w:t>
+        <w:t xml:space="preserve">, con l’esercizio svolto dello stesso tipo come riferimento.</w:t>
       </w:r>
     </w:p>
     <w:p>
@@ -211,10 +201,10 @@
           <w:b/>
           <w:bCs/>
         </w:rPr>
-        <w:t xml:space="preserve">Graduazione.</w:t>
+        <w:t xml:space="preserve">Carico costante:</w:t>
       </w:r>
       <w:r>
-        <w:t xml:space="preserve"> Dentro ogni gruppo si va da ★ a ★★; gli esercizi ★★★ non sono mai obbligatori.</w:t>
+        <w:t xml:space="preserve"> 13–16 esercizi brevi per assegnazione, graduati da ★ a ★★; i ★★★ sono facoltativi.</w:t>
       </w:r>
     </w:p>
     <w:p>
@@ -230,10 +220,10 @@
           <w:b/>
           <w:bCs/>
         </w:rPr>
-        <w:t xml:space="preserve">Ripasso a spirale.</w:t>
+        <w:t xml:space="preserve">Il compito decide le priorità:</w:t>
       </w:r>
       <w:r>
-        <w:t xml:space="preserve"> Ogni assegnazione riprende il lavoro precedente: il dominio usa le disequazioni, il segno usa il dominio, l’ultima assegnazione è un riepilogo in stile compito.</w:t>
+        <w:t xml:space="preserve"> dominio e segno, che riassumono tutto il lavoro sulle disequazioni, arrivano per ultimi e occupano più spazio. L’ultimo gruppo è in stile compito.</w:t>
       </w:r>
     </w:p>
     <w:p>
@@ -249,29 +239,10 @@
           <w:b/>
           <w:bCs/>
         </w:rPr>
-        <w:t xml:space="preserve">Varietà come nel compito:</w:t>
-      </w:r>
-      <w:r>
-        <w:t xml:space="preserve"> calcolo, lettura di grafici, test a risposta multipla, un problema.</w:t>
-      </w:r>
-    </w:p>
-    <w:p>
-      <w:pPr>
-        <w:spacing w:after="60" w:before="0"/>
-        <w:ind w:left="200"/>
-      </w:pPr>
-      <w:r>
-        <w:t xml:space="preserve">7. </w:t>
-      </w:r>
-      <w:r>
-        <w:rPr>
-          <w:b/>
-          <w:bCs/>
-        </w:rPr>
         <w:t xml:space="preserve">Riserva.</w:t>
       </w:r>
       <w:r>
-        <w:t xml:space="preserve"> Gli esercizi della raccolta non assegnati servono per il recupero, per la correzione in classe o come spunto per il compito.</w:t>
+        <w:t xml:space="preserve"> Gli esercizi della raccolta non assegnati servono per il recupero o come spunto per il compito.</w:t>
       </w:r>
     </w:p>
     <w:p>
@@ -282,14 +253,6 @@
       </w:pPr>
       <w:r>
         <w:t xml:space="preserve">Le 4 assegnazioni per casa</w:t>
-      </w:r>
-    </w:p>
-    <w:p>
-      <w:pPr>
-        <w:spacing w:after="100" w:before="0"/>
-      </w:pPr>
-      <w:r>
-        <w:t xml:space="preserve">Ogni lezione: correzione dell’assegnazione precedente (circa 20 minuti, partendo dagli esercizi indicati), poi il nuovo argomento con il metodo e gli esercizi svolti, poi l’assegnazione. La correzione dell’assegnazione 4 si fa nella lezione prima del compito.</w:t>
       </w:r>
     </w:p>
     <w:tbl>
@@ -306,9 +269,8 @@
       </w:tblPr>
       <w:tblGrid>
         <w:gridCol w:w="800"/>
-        <w:gridCol w:w="2800"/>
-        <w:gridCol w:w="4100"/>
-        <w:gridCol w:w="4500"/>
+        <w:gridCol w:w="3200"/>
+        <w:gridCol w:w="8200"/>
         <w:gridCol w:w="2400"/>
       </w:tblGrid>
       <w:tr>
@@ -348,7 +310,7 @@
         </w:tc>
         <w:tc>
           <w:tcPr>
-            <w:tcW w:type="dxa" w:w="2800"/>
+            <w:tcW w:type="dxa" w:w="3200"/>
             <w:tcBorders>
               <w:top w:val="single" w:color="A6A6A6" w:sz="4"/>
               <w:left w:val="single" w:color="A6A6A6" w:sz="4"/>
@@ -378,7 +340,7 @@
         </w:tc>
         <w:tc>
           <w:tcPr>
-            <w:tcW w:type="dxa" w:w="4100"/>
+            <w:tcW w:type="dxa" w:w="8200"/>
             <w:tcBorders>
               <w:top w:val="single" w:color="A6A6A6" w:sz="4"/>
               <w:left w:val="single" w:color="A6A6A6" w:sz="4"/>
@@ -402,37 +364,7 @@
                 <w:b/>
                 <w:bCs/>
               </w:rPr>
-              <w:t xml:space="preserve">In classe (lezione)</w:t>
-            </w:r>
-          </w:p>
-        </w:tc>
-        <w:tc>
-          <w:tcPr>
-            <w:tcW w:type="dxa" w:w="4500"/>
-            <w:tcBorders>
-              <w:top w:val="single" w:color="A6A6A6" w:sz="4"/>
-              <w:left w:val="single" w:color="A6A6A6" w:sz="4"/>
-              <w:bottom w:val="single" w:color="A6A6A6" w:sz="4"/>
-              <w:right w:val="single" w:color="A6A6A6" w:sz="4"/>
-            </w:tcBorders>
-            <w:shd w:fill="DCE6F1" w:color="auto" w:val="clear"/>
-            <w:tcMar>
-              <w:top w:type="dxa" w:w="60"/>
-              <w:left w:type="dxa" w:w="90"/>
-              <w:bottom w:type="dxa" w:w="60"/>
-              <w:right w:type="dxa" w:w="90"/>
-            </w:tcMar>
-          </w:tcPr>
-          <w:p>
-            <w:pPr>
-              <w:spacing w:after="40"/>
-            </w:pPr>
-            <w:r>
-              <w:rPr>
-                <w:b/>
-                <w:bCs/>
-              </w:rPr>
-              <w:t xml:space="preserve">Obbligatori (12)</w:t>
+              <w:t xml:space="preserve">Gruppi ed esercizi</w:t>
             </w:r>
           </w:p>
         </w:tc>
@@ -503,88 +435,104 @@
         </w:tc>
         <w:tc>
           <w:tcPr>
-            <w:tcW w:type="dxa" w:w="2800"/>
-            <w:tcBorders>
-              <w:top w:val="single" w:color="A6A6A6" w:sz="4"/>
-              <w:left w:val="single" w:color="A6A6A6" w:sz="4"/>
-              <w:bottom w:val="single" w:color="A6A6A6" w:sz="4"/>
-              <w:right w:val="single" w:color="A6A6A6" w:sz="4"/>
-            </w:tcBorders>
-            <w:tcMar>
-              <w:top w:type="dxa" w:w="60"/>
-              <w:left w:type="dxa" w:w="90"/>
-              <w:bottom w:type="dxa" w:w="60"/>
-              <w:right w:type="dxa" w:w="90"/>
-            </w:tcMar>
-          </w:tcPr>
-          <w:p>
-            <w:pPr>
-              <w:spacing w:after="40"/>
-            </w:pPr>
-            <w:r>
-              <w:rPr>
-                <w:b w:val="false"/>
-                <w:bCs w:val="false"/>
-              </w:rPr>
-              <w:t xml:space="preserve">Disequazioni (ripasso), immagini e controimmagini, dominio delle funzioni razionali</w:t>
-            </w:r>
-          </w:p>
-        </w:tc>
-        <w:tc>
-          <w:tcPr>
-            <w:tcW w:type="dxa" w:w="4100"/>
-            <w:tcBorders>
-              <w:top w:val="single" w:color="A6A6A6" w:sz="4"/>
-              <w:left w:val="single" w:color="A6A6A6" w:sz="4"/>
-              <w:bottom w:val="single" w:color="A6A6A6" w:sz="4"/>
-              <w:right w:val="single" w:color="A6A6A6" w:sz="4"/>
-            </w:tcBorders>
-            <w:tcMar>
-              <w:top w:type="dxa" w:w="60"/>
-              <w:left w:type="dxa" w:w="90"/>
-              <w:bottom w:type="dxa" w:w="60"/>
-              <w:right w:type="dxa" w:w="90"/>
-            </w:tcMar>
-          </w:tcPr>
-          <w:p>
-            <w:pPr>
-              <w:spacing w:after="40"/>
-            </w:pPr>
-            <w:r>
-              <w:rPr>
-                <w:b w:val="false"/>
-                <w:bCs w:val="false"/>
-              </w:rPr>
-              <w:t xml:space="preserve">Ripasso delle disequazioni con la dispensa e lo strumento interattivo. Eserciziario: P1, P4, P6; es. 14 pag. 18; es. 32 pag. 19.</w:t>
-            </w:r>
-          </w:p>
-        </w:tc>
-        <w:tc>
-          <w:tcPr>
-            <w:tcW w:type="dxa" w:w="4500"/>
-            <w:tcBorders>
-              <w:top w:val="single" w:color="A6A6A6" w:sz="4"/>
-              <w:left w:val="single" w:color="A6A6A6" w:sz="4"/>
-              <w:bottom w:val="single" w:color="A6A6A6" w:sz="4"/>
-              <w:right w:val="single" w:color="A6A6A6" w:sz="4"/>
-            </w:tcBorders>
-            <w:tcMar>
-              <w:top w:type="dxa" w:w="60"/>
-              <w:left w:type="dxa" w:w="90"/>
-              <w:bottom w:type="dxa" w:w="60"/>
-              <w:right w:type="dxa" w:w="90"/>
-            </w:tcMar>
-          </w:tcPr>
-          <w:p>
-            <w:pPr>
-              <w:spacing w:after="40"/>
-            </w:pPr>
-            <w:r>
-              <w:rPr>
-                <w:b w:val="false"/>
-                <w:bCs w:val="false"/>
-              </w:rPr>
-              <w:t xml:space="preserve">R1, R4, R6, R7, R9, R11 · pag. 18 n. 4, 8, 13 · pag. 19 n. 23, 29, 31</w:t>
+            <w:tcW w:type="dxa" w:w="3200"/>
+            <w:tcBorders>
+              <w:top w:val="single" w:color="A6A6A6" w:sz="4"/>
+              <w:left w:val="single" w:color="A6A6A6" w:sz="4"/>
+              <w:bottom w:val="single" w:color="A6A6A6" w:sz="4"/>
+              <w:right w:val="single" w:color="A6A6A6" w:sz="4"/>
+            </w:tcBorders>
+            <w:tcMar>
+              <w:top w:type="dxa" w:w="60"/>
+              <w:left w:type="dxa" w:w="90"/>
+              <w:bottom w:type="dxa" w:w="60"/>
+              <w:right w:type="dxa" w:w="90"/>
+            </w:tcMar>
+          </w:tcPr>
+          <w:p>
+            <w:pPr>
+              <w:spacing w:after="40"/>
+            </w:pPr>
+            <w:r>
+              <w:rPr>
+                <w:b w:val="false"/>
+                <w:bCs w:val="false"/>
+              </w:rPr>
+              <w:t xml:space="preserve">Immagini, lettura dei grafici, funzioni pari e dispari</w:t>
+            </w:r>
+          </w:p>
+        </w:tc>
+        <w:tc>
+          <w:tcPr>
+            <w:tcW w:type="dxa" w:w="8200"/>
+            <w:tcBorders>
+              <w:top w:val="single" w:color="A6A6A6" w:sz="4"/>
+              <w:left w:val="single" w:color="A6A6A6" w:sz="4"/>
+              <w:bottom w:val="single" w:color="A6A6A6" w:sz="4"/>
+              <w:right w:val="single" w:color="A6A6A6" w:sz="4"/>
+            </w:tcBorders>
+            <w:tcMar>
+              <w:top w:type="dxa" w:w="60"/>
+              <w:left w:type="dxa" w:w="90"/>
+              <w:bottom w:type="dxa" w:w="60"/>
+              <w:right w:type="dxa" w:w="90"/>
+            </w:tcMar>
+          </w:tcPr>
+          <w:p>
+            <w:pPr>
+              <w:spacing w:after="40"/>
+            </w:pPr>
+            <w:r>
+              <w:rPr>
+                <w:b/>
+                <w:bCs/>
+              </w:rPr>
+              <w:t xml:space="preserve">A.</w:t>
+            </w:r>
+            <w:r>
+              <w:rPr>
+                <w:b w:val="false"/>
+                <w:bCs w:val="false"/>
+              </w:rPr>
+              <w:t xml:space="preserve"> Immagini e controimmagini (pag. 18): 4, 6, 8, 11, 13</w:t>
+            </w:r>
+          </w:p>
+          <w:p>
+            <w:pPr>
+              <w:spacing w:after="40"/>
+            </w:pPr>
+            <w:r>
+              <w:rPr>
+                <w:b/>
+                <w:bCs/>
+              </w:rPr>
+              <w:t xml:space="preserve">B.</w:t>
+            </w:r>
+            <w:r>
+              <w:rPr>
+                <w:b w:val="false"/>
+                <w:bCs w:val="false"/>
+              </w:rPr>
+              <w:t xml:space="preserve"> Leggere il grafico di una funzione (pagg. 22, 32, 33 (figure sul libro)): 118, 120, 280, 284</w:t>
+            </w:r>
+          </w:p>
+          <w:p>
+            <w:pPr>
+              <w:spacing w:after="40"/>
+            </w:pPr>
+            <w:r>
+              <w:rPr>
+                <w:b/>
+                <w:bCs/>
+              </w:rPr>
+              <w:t xml:space="preserve">C.</w:t>
+            </w:r>
+            <w:r>
+              <w:rPr>
+                <w:b w:val="false"/>
+                <w:bCs w:val="false"/>
+              </w:rPr>
+              <w:t xml:space="preserve"> Funzioni pari e funzioni dispari (pag. 31): 265, 266, 268, 270, 275</w:t>
             </w:r>
           </w:p>
         </w:tc>
@@ -613,7 +561,7 @@
                 <w:b w:val="false"/>
                 <w:bCs w:val="false"/>
               </w:rPr>
-              <w:t xml:space="preserve">R12 · pag. 18 n. 15 · pag. 19 n. 36</w:t>
+              <w:t xml:space="preserve">344</w:t>
             </w:r>
           </w:p>
         </w:tc>
@@ -654,88 +602,123 @@
         </w:tc>
         <w:tc>
           <w:tcPr>
-            <w:tcW w:type="dxa" w:w="2800"/>
-            <w:tcBorders>
-              <w:top w:val="single" w:color="A6A6A6" w:sz="4"/>
-              <w:left w:val="single" w:color="A6A6A6" w:sz="4"/>
-              <w:bottom w:val="single" w:color="A6A6A6" w:sz="4"/>
-              <w:right w:val="single" w:color="A6A6A6" w:sz="4"/>
-            </w:tcBorders>
-            <w:tcMar>
-              <w:top w:type="dxa" w:w="60"/>
-              <w:left w:type="dxa" w:w="90"/>
-              <w:bottom w:type="dxa" w:w="60"/>
-              <w:right w:type="dxa" w:w="90"/>
-            </w:tcMar>
-          </w:tcPr>
-          <w:p>
-            <w:pPr>
-              <w:spacing w:after="40"/>
-            </w:pPr>
-            <w:r>
-              <w:rPr>
-                <w:b w:val="false"/>
-                <w:bCs w:val="false"/>
-              </w:rPr>
-              <w:t xml:space="preserve">Dominio delle funzioni irrazionali; dominio: esercizi riassuntivi</w:t>
-            </w:r>
-          </w:p>
-        </w:tc>
-        <w:tc>
-          <w:tcPr>
-            <w:tcW w:type="dxa" w:w="4100"/>
-            <w:tcBorders>
-              <w:top w:val="single" w:color="A6A6A6" w:sz="4"/>
-              <w:left w:val="single" w:color="A6A6A6" w:sz="4"/>
-              <w:bottom w:val="single" w:color="A6A6A6" w:sz="4"/>
-              <w:right w:val="single" w:color="A6A6A6" w:sz="4"/>
-            </w:tcBorders>
-            <w:tcMar>
-              <w:top w:type="dxa" w:w="60"/>
-              <w:left w:type="dxa" w:w="90"/>
-              <w:bottom w:type="dxa" w:w="60"/>
-              <w:right w:type="dxa" w:w="90"/>
-            </w:tcMar>
-          </w:tcPr>
-          <w:p>
-            <w:pPr>
-              <w:spacing w:after="40"/>
-            </w:pPr>
-            <w:r>
-              <w:rPr>
-                <w:b w:val="false"/>
-                <w:bCs w:val="false"/>
-              </w:rPr>
-              <w:t xml:space="preserve">Correzione dell’assegnazione 1 (soprattutto R7, R11, 29). Eserciziario: es. 43, 44, 63 pag. 20; es. 93 pag. 21.</w:t>
-            </w:r>
-          </w:p>
-        </w:tc>
-        <w:tc>
-          <w:tcPr>
-            <w:tcW w:type="dxa" w:w="4500"/>
-            <w:tcBorders>
-              <w:top w:val="single" w:color="A6A6A6" w:sz="4"/>
-              <w:left w:val="single" w:color="A6A6A6" w:sz="4"/>
-              <w:bottom w:val="single" w:color="A6A6A6" w:sz="4"/>
-              <w:right w:val="single" w:color="A6A6A6" w:sz="4"/>
-            </w:tcBorders>
-            <w:tcMar>
-              <w:top w:type="dxa" w:w="60"/>
-              <w:left w:type="dxa" w:w="90"/>
-              <w:bottom w:type="dxa" w:w="60"/>
-              <w:right w:type="dxa" w:w="90"/>
-            </w:tcMar>
-          </w:tcPr>
-          <w:p>
-            <w:pPr>
-              <w:spacing w:after="40"/>
-            </w:pPr>
-            <w:r>
-              <w:rPr>
-                <w:b w:val="false"/>
-                <w:bCs w:val="false"/>
-              </w:rPr>
-              <w:t xml:space="preserve">pag. 19 n. 30 · pag. 20 n. 38, 40, 41, 45, 47, 48, 57 · pag. 21 n. 81, 91, 97, 101</w:t>
+            <w:tcW w:type="dxa" w:w="3200"/>
+            <w:tcBorders>
+              <w:top w:val="single" w:color="A6A6A6" w:sz="4"/>
+              <w:left w:val="single" w:color="A6A6A6" w:sz="4"/>
+              <w:bottom w:val="single" w:color="A6A6A6" w:sz="4"/>
+              <w:right w:val="single" w:color="A6A6A6" w:sz="4"/>
+            </w:tcBorders>
+            <w:tcMar>
+              <w:top w:type="dxa" w:w="60"/>
+              <w:left w:type="dxa" w:w="90"/>
+              <w:bottom w:type="dxa" w:w="60"/>
+              <w:right w:type="dxa" w:w="90"/>
+            </w:tcMar>
+          </w:tcPr>
+          <w:p>
+            <w:pPr>
+              <w:spacing w:after="40"/>
+            </w:pPr>
+            <w:r>
+              <w:rPr>
+                <w:b w:val="false"/>
+                <w:bCs w:val="false"/>
+              </w:rPr>
+              <w:t xml:space="preserve">Funzioni composte, funzione inversa, ripasso delle disequazioni di 1° e 2° grado</w:t>
+            </w:r>
+          </w:p>
+        </w:tc>
+        <w:tc>
+          <w:tcPr>
+            <w:tcW w:type="dxa" w:w="8200"/>
+            <w:tcBorders>
+              <w:top w:val="single" w:color="A6A6A6" w:sz="4"/>
+              <w:left w:val="single" w:color="A6A6A6" w:sz="4"/>
+              <w:bottom w:val="single" w:color="A6A6A6" w:sz="4"/>
+              <w:right w:val="single" w:color="A6A6A6" w:sz="4"/>
+            </w:tcBorders>
+            <w:tcMar>
+              <w:top w:type="dxa" w:w="60"/>
+              <w:left w:type="dxa" w:w="90"/>
+              <w:bottom w:type="dxa" w:w="60"/>
+              <w:right w:type="dxa" w:w="90"/>
+            </w:tcMar>
+          </w:tcPr>
+          <w:p>
+            <w:pPr>
+              <w:spacing w:after="40"/>
+            </w:pPr>
+            <w:r>
+              <w:rPr>
+                <w:b/>
+                <w:bCs/>
+              </w:rPr>
+              <w:t xml:space="preserve">A.</w:t>
+            </w:r>
+            <w:r>
+              <w:rPr>
+                <w:b w:val="false"/>
+                <w:bCs w:val="false"/>
+              </w:rPr>
+              <w:t xml:space="preserve"> Funzioni composte (pag. 34): 292, 294, 298</w:t>
+            </w:r>
+          </w:p>
+          <w:p>
+            <w:pPr>
+              <w:spacing w:after="40"/>
+            </w:pPr>
+            <w:r>
+              <w:rPr>
+                <w:b/>
+                <w:bCs/>
+              </w:rPr>
+              <w:t xml:space="preserve">B.</w:t>
+            </w:r>
+            <w:r>
+              <w:rPr>
+                <w:b w:val="false"/>
+                <w:bCs w:val="false"/>
+              </w:rPr>
+              <w:t xml:space="preserve"> Funzione inversa (pag. 36): 312, 314, 317</w:t>
+            </w:r>
+          </w:p>
+          <w:p>
+            <w:pPr>
+              <w:spacing w:after="40"/>
+            </w:pPr>
+            <w:r>
+              <w:rPr>
+                <w:b/>
+                <w:bCs/>
+              </w:rPr>
+              <w:t xml:space="preserve">C.</w:t>
+            </w:r>
+            <w:r>
+              <w:rPr>
+                <w:b w:val="false"/>
+                <w:bCs w:val="false"/>
+              </w:rPr>
+              <w:t xml:space="preserve"> Ripasso: disequazioni di 1° grado (esercizi aggiunti, non sul libro): R1, R2, R3</w:t>
+            </w:r>
+          </w:p>
+          <w:p>
+            <w:pPr>
+              <w:spacing w:after="40"/>
+            </w:pPr>
+            <w:r>
+              <w:rPr>
+                <w:b/>
+                <w:bCs/>
+              </w:rPr>
+              <w:t xml:space="preserve">D.</w:t>
+            </w:r>
+            <w:r>
+              <w:rPr>
+                <w:b w:val="false"/>
+                <w:bCs w:val="false"/>
+              </w:rPr>
+              <w:t xml:space="preserve"> Ripasso: disequazioni di 2° grado (esercizi aggiunti, non sul libro): R5, R6, R7, R8, R9</w:t>
             </w:r>
           </w:p>
         </w:tc>
@@ -764,7 +747,7 @@
                 <w:b w:val="false"/>
                 <w:bCs w:val="false"/>
               </w:rPr>
-              <w:t xml:space="preserve">pag. 21 n. 103, 106</w:t>
+              <w:t xml:space="preserve">299, 319</w:t>
             </w:r>
           </w:p>
         </w:tc>
@@ -805,88 +788,104 @@
         </w:tc>
         <w:tc>
           <w:tcPr>
-            <w:tcW w:type="dxa" w:w="2800"/>
-            <w:tcBorders>
-              <w:top w:val="single" w:color="A6A6A6" w:sz="4"/>
-              <w:left w:val="single" w:color="A6A6A6" w:sz="4"/>
-              <w:bottom w:val="single" w:color="A6A6A6" w:sz="4"/>
-              <w:right w:val="single" w:color="A6A6A6" w:sz="4"/>
-            </w:tcBorders>
-            <w:tcMar>
-              <w:top w:type="dxa" w:w="60"/>
-              <w:left w:type="dxa" w:w="90"/>
-              <w:bottom w:type="dxa" w:w="60"/>
-              <w:right w:type="dxa" w:w="90"/>
-            </w:tcMar>
-          </w:tcPr>
-          <w:p>
-            <w:pPr>
-              <w:spacing w:after="40"/>
-            </w:pPr>
-            <w:r>
-              <w:rPr>
-                <w:b w:val="false"/>
-                <w:bCs w:val="false"/>
-              </w:rPr>
-              <w:t xml:space="preserve">Leggere un grafico; segno e zeri; funzioni pari e dispari</w:t>
-            </w:r>
-          </w:p>
-        </w:tc>
-        <w:tc>
-          <w:tcPr>
-            <w:tcW w:type="dxa" w:w="4100"/>
-            <w:tcBorders>
-              <w:top w:val="single" w:color="A6A6A6" w:sz="4"/>
-              <w:left w:val="single" w:color="A6A6A6" w:sz="4"/>
-              <w:bottom w:val="single" w:color="A6A6A6" w:sz="4"/>
-              <w:right w:val="single" w:color="A6A6A6" w:sz="4"/>
-            </w:tcBorders>
-            <w:tcMar>
-              <w:top w:type="dxa" w:w="60"/>
-              <w:left w:type="dxa" w:w="90"/>
-              <w:bottom w:type="dxa" w:w="60"/>
-              <w:right w:type="dxa" w:w="90"/>
-            </w:tcMar>
-          </w:tcPr>
-          <w:p>
-            <w:pPr>
-              <w:spacing w:after="40"/>
-            </w:pPr>
-            <w:r>
-              <w:rPr>
-                <w:b w:val="false"/>
-                <w:bCs w:val="false"/>
-              </w:rPr>
-              <w:t xml:space="preserve">Correzione dell’assegnazione 2 (soprattutto 48, 57, 101). Eserciziario: es. 285 pag. 33; es. 242 pag. 29; es. 272 pag. 31.</w:t>
-            </w:r>
-          </w:p>
-        </w:tc>
-        <w:tc>
-          <w:tcPr>
-            <w:tcW w:type="dxa" w:w="4500"/>
-            <w:tcBorders>
-              <w:top w:val="single" w:color="A6A6A6" w:sz="4"/>
-              <w:left w:val="single" w:color="A6A6A6" w:sz="4"/>
-              <w:bottom w:val="single" w:color="A6A6A6" w:sz="4"/>
-              <w:right w:val="single" w:color="A6A6A6" w:sz="4"/>
-            </w:tcBorders>
-            <w:tcMar>
-              <w:top w:type="dxa" w:w="60"/>
-              <w:left w:type="dxa" w:w="90"/>
-              <w:bottom w:type="dxa" w:w="60"/>
-              <w:right w:type="dxa" w:w="90"/>
-            </w:tcMar>
-          </w:tcPr>
-          <w:p>
-            <w:pPr>
-              <w:spacing w:after="40"/>
-            </w:pPr>
-            <w:r>
-              <w:rPr>
-                <w:b w:val="false"/>
-                <w:bCs w:val="false"/>
-              </w:rPr>
-              <w:t xml:space="preserve">pag. 22 n. 118, 121 · pag. 32 n. 280 · pag. 33 n. 284 · pag. 29 n. 233, 234, 241, 244 · pag. 31 n. 265, 267, 269, 273</w:t>
+            <w:tcW w:type="dxa" w:w="3200"/>
+            <w:tcBorders>
+              <w:top w:val="single" w:color="A6A6A6" w:sz="4"/>
+              <w:left w:val="single" w:color="A6A6A6" w:sz="4"/>
+              <w:bottom w:val="single" w:color="A6A6A6" w:sz="4"/>
+              <w:right w:val="single" w:color="A6A6A6" w:sz="4"/>
+            </w:tcBorders>
+            <w:tcMar>
+              <w:top w:type="dxa" w:w="60"/>
+              <w:left w:type="dxa" w:w="90"/>
+              <w:bottom w:type="dxa" w:w="60"/>
+              <w:right w:type="dxa" w:w="90"/>
+            </w:tcMar>
+          </w:tcPr>
+          <w:p>
+            <w:pPr>
+              <w:spacing w:after="40"/>
+            </w:pPr>
+            <w:r>
+              <w:rPr>
+                <w:b w:val="false"/>
+                <w:bCs w:val="false"/>
+              </w:rPr>
+              <w:t xml:space="preserve">Disequazioni fratte, dominio delle funzioni razionali e irrazionali</w:t>
+            </w:r>
+          </w:p>
+        </w:tc>
+        <w:tc>
+          <w:tcPr>
+            <w:tcW w:type="dxa" w:w="8200"/>
+            <w:tcBorders>
+              <w:top w:val="single" w:color="A6A6A6" w:sz="4"/>
+              <w:left w:val="single" w:color="A6A6A6" w:sz="4"/>
+              <w:bottom w:val="single" w:color="A6A6A6" w:sz="4"/>
+              <w:right w:val="single" w:color="A6A6A6" w:sz="4"/>
+            </w:tcBorders>
+            <w:tcMar>
+              <w:top w:type="dxa" w:w="60"/>
+              <w:left w:type="dxa" w:w="90"/>
+              <w:bottom w:type="dxa" w:w="60"/>
+              <w:right w:type="dxa" w:w="90"/>
+            </w:tcMar>
+          </w:tcPr>
+          <w:p>
+            <w:pPr>
+              <w:spacing w:after="40"/>
+            </w:pPr>
+            <w:r>
+              <w:rPr>
+                <w:b/>
+                <w:bCs/>
+              </w:rPr>
+              <w:t xml:space="preserve">A.</w:t>
+            </w:r>
+            <w:r>
+              <w:rPr>
+                <w:b w:val="false"/>
+                <w:bCs w:val="false"/>
+              </w:rPr>
+              <w:t xml:space="preserve"> Ripasso: disequazioni fratte (esercizi aggiunti, non sul libro): R11, R12, R13, R14</w:t>
+            </w:r>
+          </w:p>
+          <w:p>
+            <w:pPr>
+              <w:spacing w:after="40"/>
+            </w:pPr>
+            <w:r>
+              <w:rPr>
+                <w:b/>
+                <w:bCs/>
+              </w:rPr>
+              <w:t xml:space="preserve">B.</w:t>
+            </w:r>
+            <w:r>
+              <w:rPr>
+                <w:b w:val="false"/>
+                <w:bCs w:val="false"/>
+              </w:rPr>
+              <w:t xml:space="preserve"> Dominio delle funzioni razionali (pag. 19): 23, 25, 29, 31, 34</w:t>
+            </w:r>
+          </w:p>
+          <w:p>
+            <w:pPr>
+              <w:spacing w:after="40"/>
+            </w:pPr>
+            <w:r>
+              <w:rPr>
+                <w:b/>
+                <w:bCs/>
+              </w:rPr>
+              <w:t xml:space="preserve">C.</w:t>
+            </w:r>
+            <w:r>
+              <w:rPr>
+                <w:b w:val="false"/>
+                <w:bCs w:val="false"/>
+              </w:rPr>
+              <w:t xml:space="preserve"> Dominio delle funzioni irrazionali (pag. 20): 38, 40, 41, 45, 48</w:t>
             </w:r>
           </w:p>
         </w:tc>
@@ -915,7 +914,7 @@
                 <w:b w:val="false"/>
                 <w:bCs w:val="false"/>
               </w:rPr>
-              <w:t xml:space="preserve">pag. 29 n. 243 · pag. 39 n. 344 · pag. 31 n. 277</w:t>
+              <w:t xml:space="preserve">36</w:t>
             </w:r>
           </w:p>
         </w:tc>
@@ -956,88 +955,104 @@
         </w:tc>
         <w:tc>
           <w:tcPr>
-            <w:tcW w:type="dxa" w:w="2800"/>
-            <w:tcBorders>
-              <w:top w:val="single" w:color="A6A6A6" w:sz="4"/>
-              <w:left w:val="single" w:color="A6A6A6" w:sz="4"/>
-              <w:bottom w:val="single" w:color="A6A6A6" w:sz="4"/>
-              <w:right w:val="single" w:color="A6A6A6" w:sz="4"/>
-            </w:tcBorders>
-            <w:tcMar>
-              <w:top w:type="dxa" w:w="60"/>
-              <w:left w:type="dxa" w:w="90"/>
-              <w:bottom w:type="dxa" w:w="60"/>
-              <w:right w:type="dxa" w:w="90"/>
-            </w:tcMar>
-          </w:tcPr>
-          <w:p>
-            <w:pPr>
-              <w:spacing w:after="40"/>
-            </w:pPr>
-            <w:r>
-              <w:rPr>
-                <w:b w:val="false"/>
-                <w:bCs w:val="false"/>
-              </w:rPr>
-              <w:t xml:space="preserve">Funzioni composte; funzione inversa; riepilogo verso il compito</w:t>
-            </w:r>
-          </w:p>
-        </w:tc>
-        <w:tc>
-          <w:tcPr>
-            <w:tcW w:type="dxa" w:w="4100"/>
-            <w:tcBorders>
-              <w:top w:val="single" w:color="A6A6A6" w:sz="4"/>
-              <w:left w:val="single" w:color="A6A6A6" w:sz="4"/>
-              <w:bottom w:val="single" w:color="A6A6A6" w:sz="4"/>
-              <w:right w:val="single" w:color="A6A6A6" w:sz="4"/>
-            </w:tcBorders>
-            <w:tcMar>
-              <w:top w:type="dxa" w:w="60"/>
-              <w:left w:type="dxa" w:w="90"/>
-              <w:bottom w:type="dxa" w:w="60"/>
-              <w:right w:type="dxa" w:w="90"/>
-            </w:tcMar>
-          </w:tcPr>
-          <w:p>
-            <w:pPr>
-              <w:spacing w:after="40"/>
-            </w:pPr>
-            <w:r>
-              <w:rPr>
-                <w:b w:val="false"/>
-                <w:bCs w:val="false"/>
-              </w:rPr>
-              <w:t xml:space="preserve">Correzione dell’assegnazione 3 (soprattutto 284, 241, 269). Eserciziario: es. 291, 297 pag. 34; es. 311, 318 pag. 36.</w:t>
-            </w:r>
-          </w:p>
-        </w:tc>
-        <w:tc>
-          <w:tcPr>
-            <w:tcW w:type="dxa" w:w="4500"/>
-            <w:tcBorders>
-              <w:top w:val="single" w:color="A6A6A6" w:sz="4"/>
-              <w:left w:val="single" w:color="A6A6A6" w:sz="4"/>
-              <w:bottom w:val="single" w:color="A6A6A6" w:sz="4"/>
-              <w:right w:val="single" w:color="A6A6A6" w:sz="4"/>
-            </w:tcBorders>
-            <w:tcMar>
-              <w:top w:type="dxa" w:w="60"/>
-              <w:left w:type="dxa" w:w="90"/>
-              <w:bottom w:type="dxa" w:w="60"/>
-              <w:right w:type="dxa" w:w="90"/>
-            </w:tcMar>
-          </w:tcPr>
-          <w:p>
-            <w:pPr>
-              <w:spacing w:after="40"/>
-            </w:pPr>
-            <w:r>
-              <w:rPr>
-                <w:b w:val="false"/>
-                <w:bCs w:val="false"/>
-              </w:rPr>
-              <w:t xml:space="preserve">pag. 34 n. 292, 294, 298, 301 · pag. 36 n. 312, 313, 317 · pag. 37 n. 328, 331 · pag. 40 n. 349, 352, 355</w:t>
+            <w:tcW w:type="dxa" w:w="3200"/>
+            <w:tcBorders>
+              <w:top w:val="single" w:color="A6A6A6" w:sz="4"/>
+              <w:left w:val="single" w:color="A6A6A6" w:sz="4"/>
+              <w:bottom w:val="single" w:color="A6A6A6" w:sz="4"/>
+              <w:right w:val="single" w:color="A6A6A6" w:sz="4"/>
+            </w:tcBorders>
+            <w:tcMar>
+              <w:top w:type="dxa" w:w="60"/>
+              <w:left w:type="dxa" w:w="90"/>
+              <w:bottom w:type="dxa" w:w="60"/>
+              <w:right w:type="dxa" w:w="90"/>
+            </w:tcMar>
+          </w:tcPr>
+          <w:p>
+            <w:pPr>
+              <w:spacing w:after="40"/>
+            </w:pPr>
+            <w:r>
+              <w:rPr>
+                <w:b w:val="false"/>
+                <w:bCs w:val="false"/>
+              </w:rPr>
+              <w:t xml:space="preserve">Dominio con radici e frazioni, segno e zeri, riepilogo verso il compito</w:t>
+            </w:r>
+          </w:p>
+        </w:tc>
+        <w:tc>
+          <w:tcPr>
+            <w:tcW w:type="dxa" w:w="8200"/>
+            <w:tcBorders>
+              <w:top w:val="single" w:color="A6A6A6" w:sz="4"/>
+              <w:left w:val="single" w:color="A6A6A6" w:sz="4"/>
+              <w:bottom w:val="single" w:color="A6A6A6" w:sz="4"/>
+              <w:right w:val="single" w:color="A6A6A6" w:sz="4"/>
+            </w:tcBorders>
+            <w:tcMar>
+              <w:top w:type="dxa" w:w="60"/>
+              <w:left w:type="dxa" w:w="90"/>
+              <w:bottom w:type="dxa" w:w="60"/>
+              <w:right w:type="dxa" w:w="90"/>
+            </w:tcMar>
+          </w:tcPr>
+          <w:p>
+            <w:pPr>
+              <w:spacing w:after="40"/>
+            </w:pPr>
+            <w:r>
+              <w:rPr>
+                <w:b/>
+                <w:bCs/>
+              </w:rPr>
+              <w:t xml:space="preserve">A.</w:t>
+            </w:r>
+            <w:r>
+              <w:rPr>
+                <w:b w:val="false"/>
+                <w:bCs w:val="false"/>
+              </w:rPr>
+              <w:t xml:space="preserve"> Dominio: radici e frazioni insieme (pagg. 20, 21): 47, 49, 57, 97, 101</w:t>
+            </w:r>
+          </w:p>
+          <w:p>
+            <w:pPr>
+              <w:spacing w:after="40"/>
+            </w:pPr>
+            <w:r>
+              <w:rPr>
+                <w:b/>
+                <w:bCs/>
+              </w:rPr>
+              <w:t xml:space="preserve">B.</w:t>
+            </w:r>
+            <w:r>
+              <w:rPr>
+                <w:b w:val="false"/>
+                <w:bCs w:val="false"/>
+              </w:rPr>
+              <w:t xml:space="preserve"> Segno e zeri di una funzione (pag. 29): 233, 234, 241, 244</w:t>
+            </w:r>
+          </w:p>
+          <w:p>
+            <w:pPr>
+              <w:spacing w:after="40"/>
+            </w:pPr>
+            <w:r>
+              <w:rPr>
+                <w:b/>
+                <w:bCs/>
+              </w:rPr>
+              <w:t xml:space="preserve">C.</w:t>
+            </w:r>
+            <w:r>
+              <w:rPr>
+                <w:b w:val="false"/>
+                <w:bCs w:val="false"/>
+              </w:rPr>
+              <w:t xml:space="preserve"> Riepilogo verso il compito (pagg. 37, 40): 328, 331, 349, 352</w:t>
             </w:r>
           </w:p>
         </w:tc>
@@ -1066,7 +1081,7 @@
                 <w:b w:val="false"/>
                 <w:bCs w:val="false"/>
               </w:rPr>
-              <w:t xml:space="preserve">pag. 34 n. 299 · pag. 36 n. 319 · pag. 40 n. 350 (tipo compito)</w:t>
+              <w:t xml:space="preserve">103, 350</w:t>
             </w:r>
           </w:p>
         </w:tc>
@@ -1094,7 +1109,7 @@
         <w:t xml:space="preserve">Libro:</w:t>
       </w:r>
       <w:r>
-        <w:t xml:space="preserve"> esercizi aggiunti (R1–R12)   ·   </w:t>
+        <w:t xml:space="preserve"> esercizi aggiunti (R1–R14)   ·   </w:t>
       </w:r>
       <w:r>
         <w:rPr>
@@ -1119,7 +1134,7 @@
         <w:ind w:left="200" w:right="100"/>
       </w:pPr>
       <w:r>
-        <w:t xml:space="preserve">Questi esercizi non sono nell’estratto del libro: sono esercizi di ripasso aggiunti, sullo stile della dispensa. Il testo è nella scheda delle assegnazioni per gli studenti.</w:t>
+        <w:t xml:space="preserve">Questi esercizi non sono nell’estratto del libro: sono esercizi di ripasso aggiunti, sullo stile della dispensa. Il testo è nei file delle assegnazioni 2 e 3.</w:t>
       </w:r>
     </w:p>
     <w:p>
@@ -1422,7 +1437,7 @@
                 <w:b/>
                 <w:bCs/>
               </w:rPr>
-              <w:t xml:space="preserve">A1</w:t>
+              <w:t xml:space="preserve">A2-C</w:t>
             </w:r>
           </w:p>
         </w:tc>
@@ -1636,10 +1651,10 @@
             </w:pPr>
             <w:r>
               <w:rPr>
-                <w:b w:val="false"/>
-                <w:bCs w:val="false"/>
-              </w:rPr>
-              <w:t xml:space="preserve">—</w:t>
+                <w:b/>
+                <w:bCs/>
+              </w:rPr>
+              <w:t xml:space="preserve">A2-C</w:t>
             </w:r>
           </w:p>
         </w:tc>
@@ -1863,10 +1878,10 @@
             </w:pPr>
             <w:r>
               <w:rPr>
-                <w:b w:val="false"/>
-                <w:bCs w:val="false"/>
-              </w:rPr>
-              <w:t xml:space="preserve">—</w:t>
+                <w:b/>
+                <w:bCs/>
+              </w:rPr>
+              <w:t xml:space="preserve">A2-C</w:t>
             </w:r>
           </w:p>
         </w:tc>
@@ -2068,10 +2083,10 @@
             </w:pPr>
             <w:r>
               <w:rPr>
-                <w:b/>
-                <w:bCs/>
-              </w:rPr>
-              <w:t xml:space="preserve">A1</w:t>
+                <w:b w:val="false"/>
+                <w:bCs w:val="false"/>
+              </w:rPr>
+              <w:t xml:space="preserve">—</w:t>
             </w:r>
           </w:p>
         </w:tc>
@@ -2295,10 +2310,10 @@
             </w:pPr>
             <w:r>
               <w:rPr>
-                <w:b w:val="false"/>
-                <w:bCs w:val="false"/>
-              </w:rPr>
-              <w:t xml:space="preserve">—</w:t>
+                <w:b/>
+                <w:bCs/>
+              </w:rPr>
+              <w:t xml:space="preserve">A2-D</w:t>
             </w:r>
           </w:p>
         </w:tc>
@@ -2530,7 +2545,7 @@
                 <w:b/>
                 <w:bCs/>
               </w:rPr>
-              <w:t xml:space="preserve">A1</w:t>
+              <w:t xml:space="preserve">A2-D</w:t>
             </w:r>
           </w:p>
         </w:tc>
@@ -2772,7 +2787,7 @@
                 <w:b/>
                 <w:bCs/>
               </w:rPr>
-              <w:t xml:space="preserve">A1</w:t>
+              <w:t xml:space="preserve">A2-D</w:t>
             </w:r>
           </w:p>
         </w:tc>
@@ -3012,10 +3027,10 @@
             </w:pPr>
             <w:r>
               <w:rPr>
-                <w:b w:val="false"/>
-                <w:bCs w:val="false"/>
-              </w:rPr>
-              <w:t xml:space="preserve">—</w:t>
+                <w:b/>
+                <w:bCs/>
+              </w:rPr>
+              <w:t xml:space="preserve">A2-D</w:t>
             </w:r>
           </w:p>
         </w:tc>
@@ -3287,7 +3302,7 @@
                 <w:b/>
                 <w:bCs/>
               </w:rPr>
-              <w:t xml:space="preserve">A1</w:t>
+              <w:t xml:space="preserve">A2-D</w:t>
             </w:r>
           </w:p>
         </w:tc>
@@ -3736,7 +3751,7 @@
                 <w:b/>
                 <w:bCs/>
               </w:rPr>
-              <w:t xml:space="preserve">A1</w:t>
+              <w:t xml:space="preserve">A3-A</w:t>
             </w:r>
           </w:p>
         </w:tc>
@@ -4024,14 +4039,7 @@
                 <w:b/>
                 <w:bCs/>
               </w:rPr>
-              <w:t xml:space="preserve">A1</w:t>
-            </w:r>
-            <w:r>
-              <w:rPr>
-                <w:b w:val="false"/>
-                <w:bCs w:val="false"/>
-              </w:rPr>
-              <w:t xml:space="preserve">*</w:t>
+              <w:t xml:space="preserve">A3-A</w:t>
             </w:r>
           </w:p>
         </w:tc>
@@ -4227,19 +4235,584 @@
                 <w:b w:val="false"/>
                 <w:bCs w:val="false"/>
               </w:rPr>
-              <w:t xml:space="preserve">: segni </w:t>
-            </w:r>
-            <m:oMath>
-              <m:r>
-                <m:t>−,+,−,+</m:t>
-              </m:r>
-            </m:oMath>
-            <w:r>
-              <w:rPr>
-                <w:b w:val="false"/>
-                <w:bCs w:val="false"/>
-              </w:rPr>
-              <w:t xml:space="preserve">.  ★★★</w:t>
+              <w:t xml:space="preserve">: segni −, +, −, +.  ★★★</w:t>
+            </w:r>
+          </w:p>
+        </w:tc>
+      </w:tr>
+      <w:tr>
+        <w:trPr>
+          <w:cantSplit/>
+          <w:tblHeader w:val="false"/>
+        </w:trPr>
+        <w:tc>
+          <w:tcPr>
+            <w:tcW w:type="dxa" w:w="650"/>
+            <w:tcBorders>
+              <w:top w:val="single" w:color="A6A6A6" w:sz="4"/>
+              <w:left w:val="single" w:color="A6A6A6" w:sz="4"/>
+              <w:bottom w:val="single" w:color="A6A6A6" w:sz="4"/>
+              <w:right w:val="single" w:color="A6A6A6" w:sz="4"/>
+            </w:tcBorders>
+            <w:tcMar>
+              <w:top w:type="dxa" w:w="60"/>
+              <w:left w:type="dxa" w:w="90"/>
+              <w:bottom w:type="dxa" w:w="60"/>
+              <w:right w:type="dxa" w:w="90"/>
+            </w:tcMar>
+          </w:tcPr>
+          <w:p>
+            <w:pPr>
+              <w:spacing w:after="40"/>
+            </w:pPr>
+            <w:r>
+              <w:rPr>
+                <w:b w:val="false"/>
+                <w:bCs w:val="false"/>
+              </w:rPr>
+              <w:t xml:space="preserve">R13</w:t>
+            </w:r>
+          </w:p>
+        </w:tc>
+        <w:tc>
+          <w:tcPr>
+            <w:tcW w:type="dxa" w:w="800"/>
+            <w:tcBorders>
+              <w:top w:val="single" w:color="A6A6A6" w:sz="4"/>
+              <w:left w:val="single" w:color="A6A6A6" w:sz="4"/>
+              <w:bottom w:val="single" w:color="A6A6A6" w:sz="4"/>
+              <w:right w:val="single" w:color="A6A6A6" w:sz="4"/>
+            </w:tcBorders>
+            <w:tcMar>
+              <w:top w:type="dxa" w:w="60"/>
+              <w:left w:type="dxa" w:w="90"/>
+              <w:bottom w:type="dxa" w:w="60"/>
+              <w:right w:type="dxa" w:w="90"/>
+            </w:tcMar>
+          </w:tcPr>
+          <w:p>
+            <w:pPr>
+              <w:spacing w:after="40"/>
+            </w:pPr>
+            <w:r>
+              <w:rPr>
+                <w:b w:val="false"/>
+                <w:bCs w:val="false"/>
+              </w:rPr>
+              <w:t xml:space="preserve">—</w:t>
+            </w:r>
+          </w:p>
+        </w:tc>
+        <w:tc>
+          <w:tcPr>
+            <w:tcW w:type="dxa" w:w="800"/>
+            <w:tcBorders>
+              <w:top w:val="single" w:color="A6A6A6" w:sz="4"/>
+              <w:left w:val="single" w:color="A6A6A6" w:sz="4"/>
+              <w:bottom w:val="single" w:color="A6A6A6" w:sz="4"/>
+              <w:right w:val="single" w:color="A6A6A6" w:sz="4"/>
+            </w:tcBorders>
+            <w:tcMar>
+              <w:top w:type="dxa" w:w="60"/>
+              <w:left w:type="dxa" w:w="90"/>
+              <w:bottom w:type="dxa" w:w="60"/>
+              <w:right w:type="dxa" w:w="90"/>
+            </w:tcMar>
+          </w:tcPr>
+          <w:p>
+            <w:pPr>
+              <w:spacing w:after="40"/>
+            </w:pPr>
+            <w:r>
+              <w:rPr>
+                <w:b/>
+                <w:bCs/>
+              </w:rPr>
+              <w:t xml:space="preserve">A3-A</w:t>
+            </w:r>
+          </w:p>
+        </w:tc>
+        <w:tc>
+          <w:tcPr>
+            <w:tcW w:type="dxa" w:w="3250"/>
+            <w:tcBorders>
+              <w:top w:val="single" w:color="A6A6A6" w:sz="4"/>
+              <w:left w:val="single" w:color="A6A6A6" w:sz="4"/>
+              <w:bottom w:val="single" w:color="A6A6A6" w:sz="4"/>
+              <w:right w:val="single" w:color="A6A6A6" w:sz="4"/>
+            </w:tcBorders>
+            <w:tcMar>
+              <w:top w:type="dxa" w:w="60"/>
+              <w:left w:type="dxa" w:w="90"/>
+              <w:bottom w:type="dxa" w:w="60"/>
+              <w:right w:type="dxa" w:w="90"/>
+            </w:tcMar>
+          </w:tcPr>
+          <w:p>
+            <w:pPr>
+              <w:spacing w:after="40"/>
+            </w:pPr>
+            <m:oMath>
+              <m:f>
+                <m:num>
+                  <m:r>
+                    <m:t>3−x</m:t>
+                  </m:r>
+                </m:num>
+                <m:den>
+                  <m:r>
+                    <m:t>x+1</m:t>
+                  </m:r>
+                </m:den>
+              </m:f>
+              <m:r>
+                <m:t>≥0</m:t>
+              </m:r>
+            </m:oMath>
+          </w:p>
+        </w:tc>
+        <w:tc>
+          <w:tcPr>
+            <w:tcW w:type="dxa" w:w="4200"/>
+            <w:tcBorders>
+              <w:top w:val="single" w:color="A6A6A6" w:sz="4"/>
+              <w:left w:val="single" w:color="A6A6A6" w:sz="4"/>
+              <w:bottom w:val="single" w:color="A6A6A6" w:sz="4"/>
+              <w:right w:val="single" w:color="A6A6A6" w:sz="4"/>
+            </w:tcBorders>
+            <w:tcMar>
+              <w:top w:type="dxa" w:w="60"/>
+              <w:left w:type="dxa" w:w="90"/>
+              <w:bottom w:type="dxa" w:w="60"/>
+              <w:right w:type="dxa" w:w="90"/>
+            </w:tcMar>
+          </w:tcPr>
+          <w:p>
+            <w:pPr>
+              <w:spacing w:after="40"/>
+            </w:pPr>
+            <m:oMath>
+              <m:r>
+                <m:t>−1&lt;x≤3</m:t>
+              </m:r>
+            </m:oMath>
+          </w:p>
+        </w:tc>
+        <w:tc>
+          <w:tcPr>
+            <w:tcW w:type="dxa" w:w="4900"/>
+            <w:tcBorders>
+              <w:top w:val="single" w:color="A6A6A6" w:sz="4"/>
+              <w:left w:val="single" w:color="A6A6A6" w:sz="4"/>
+              <w:bottom w:val="single" w:color="A6A6A6" w:sz="4"/>
+              <w:right w:val="single" w:color="A6A6A6" w:sz="4"/>
+            </w:tcBorders>
+            <w:tcMar>
+              <w:top w:type="dxa" w:w="60"/>
+              <w:left w:type="dxa" w:w="90"/>
+              <w:bottom w:type="dxa" w:w="60"/>
+              <w:right w:type="dxa" w:w="90"/>
+            </w:tcMar>
+          </w:tcPr>
+          <w:p>
+            <w:pPr>
+              <w:spacing w:after="40"/>
+            </w:pPr>
+            <w:r>
+              <w:rPr>
+                <w:b w:val="false"/>
+                <w:bCs w:val="false"/>
+              </w:rPr>
+              <w:t xml:space="preserve">N </w:t>
+            </w:r>
+            <w:r>
+              <w:rPr>
+                <w:b w:val="false"/>
+                <w:bCs w:val="false"/>
+              </w:rPr>
+              <w:t xml:space="preserve"> ≥0 </w:t>
+            </w:r>
+            <w:r>
+              <w:rPr>
+                <w:b w:val="false"/>
+                <w:bCs w:val="false"/>
+              </w:rPr>
+              <w:t xml:space="preserve">: </w:t>
+            </w:r>
+            <m:oMath>
+              <m:r>
+                <m:t>x≤3</m:t>
+              </m:r>
+            </m:oMath>
+            <w:r>
+              <w:rPr>
+                <w:b w:val="false"/>
+                <w:bCs w:val="false"/>
+              </w:rPr>
+              <w:t xml:space="preserve">; D </w:t>
+            </w:r>
+            <w:r>
+              <w:rPr>
+                <w:b w:val="false"/>
+                <w:bCs w:val="false"/>
+              </w:rPr>
+              <w:t xml:space="preserve"> &gt;0 </w:t>
+            </w:r>
+            <w:r>
+              <w:rPr>
+                <w:b w:val="false"/>
+                <w:bCs w:val="false"/>
+              </w:rPr>
+              <w:t xml:space="preserve">: </w:t>
+            </w:r>
+            <m:oMath>
+              <m:r>
+                <m:t>x&gt;−1</m:t>
+              </m:r>
+            </m:oMath>
+            <w:r>
+              <w:rPr>
+                <w:b w:val="false"/>
+                <w:bCs w:val="false"/>
+              </w:rPr>
+              <w:t xml:space="preserve">. Tabella: positivo solo tra </w:t>
+            </w:r>
+            <m:oMath>
+              <m:r>
+                <m:t>−1</m:t>
+              </m:r>
+            </m:oMath>
+            <w:r>
+              <w:rPr>
+                <w:b w:val="false"/>
+                <w:bCs w:val="false"/>
+              </w:rPr>
+              <w:t xml:space="preserve"> e </w:t>
+            </w:r>
+            <m:oMath>
+              <m:r>
+                <m:t>3</m:t>
+              </m:r>
+            </m:oMath>
+            <w:r>
+              <w:rPr>
+                <w:b w:val="false"/>
+                <w:bCs w:val="false"/>
+              </w:rPr>
+              <w:t xml:space="preserve">; </w:t>
+            </w:r>
+            <m:oMath>
+              <m:r>
+                <m:t>3</m:t>
+              </m:r>
+            </m:oMath>
+            <w:r>
+              <w:rPr>
+                <w:b w:val="false"/>
+                <w:bCs w:val="false"/>
+              </w:rPr>
+              <w:t xml:space="preserve"> incluso, </w:t>
+            </w:r>
+            <m:oMath>
+              <m:r>
+                <m:t>−1</m:t>
+              </m:r>
+            </m:oMath>
+            <w:r>
+              <w:rPr>
+                <w:b w:val="false"/>
+                <w:bCs w:val="false"/>
+              </w:rPr>
+              <w:t xml:space="preserve"> escluso.  ★★☆</w:t>
+            </w:r>
+          </w:p>
+        </w:tc>
+      </w:tr>
+      <w:tr>
+        <w:trPr>
+          <w:cantSplit/>
+          <w:tblHeader w:val="false"/>
+        </w:trPr>
+        <w:tc>
+          <w:tcPr>
+            <w:tcW w:type="dxa" w:w="650"/>
+            <w:tcBorders>
+              <w:top w:val="single" w:color="A6A6A6" w:sz="4"/>
+              <w:left w:val="single" w:color="A6A6A6" w:sz="4"/>
+              <w:bottom w:val="single" w:color="A6A6A6" w:sz="4"/>
+              <w:right w:val="single" w:color="A6A6A6" w:sz="4"/>
+            </w:tcBorders>
+            <w:tcMar>
+              <w:top w:type="dxa" w:w="60"/>
+              <w:left w:type="dxa" w:w="90"/>
+              <w:bottom w:type="dxa" w:w="60"/>
+              <w:right w:type="dxa" w:w="90"/>
+            </w:tcMar>
+          </w:tcPr>
+          <w:p>
+            <w:pPr>
+              <w:spacing w:after="40"/>
+            </w:pPr>
+            <w:r>
+              <w:rPr>
+                <w:b w:val="false"/>
+                <w:bCs w:val="false"/>
+              </w:rPr>
+              <w:t xml:space="preserve">R14</w:t>
+            </w:r>
+          </w:p>
+        </w:tc>
+        <w:tc>
+          <w:tcPr>
+            <w:tcW w:type="dxa" w:w="800"/>
+            <w:tcBorders>
+              <w:top w:val="single" w:color="A6A6A6" w:sz="4"/>
+              <w:left w:val="single" w:color="A6A6A6" w:sz="4"/>
+              <w:bottom w:val="single" w:color="A6A6A6" w:sz="4"/>
+              <w:right w:val="single" w:color="A6A6A6" w:sz="4"/>
+            </w:tcBorders>
+            <w:tcMar>
+              <w:top w:type="dxa" w:w="60"/>
+              <w:left w:type="dxa" w:w="90"/>
+              <w:bottom w:type="dxa" w:w="60"/>
+              <w:right w:type="dxa" w:w="90"/>
+            </w:tcMar>
+          </w:tcPr>
+          <w:p>
+            <w:pPr>
+              <w:spacing w:after="40"/>
+            </w:pPr>
+            <w:r>
+              <w:rPr>
+                <w:b w:val="false"/>
+                <w:bCs w:val="false"/>
+              </w:rPr>
+              <w:t xml:space="preserve">—</w:t>
+            </w:r>
+          </w:p>
+        </w:tc>
+        <w:tc>
+          <w:tcPr>
+            <w:tcW w:type="dxa" w:w="800"/>
+            <w:tcBorders>
+              <w:top w:val="single" w:color="A6A6A6" w:sz="4"/>
+              <w:left w:val="single" w:color="A6A6A6" w:sz="4"/>
+              <w:bottom w:val="single" w:color="A6A6A6" w:sz="4"/>
+              <w:right w:val="single" w:color="A6A6A6" w:sz="4"/>
+            </w:tcBorders>
+            <w:tcMar>
+              <w:top w:type="dxa" w:w="60"/>
+              <w:left w:type="dxa" w:w="90"/>
+              <w:bottom w:type="dxa" w:w="60"/>
+              <w:right w:type="dxa" w:w="90"/>
+            </w:tcMar>
+          </w:tcPr>
+          <w:p>
+            <w:pPr>
+              <w:spacing w:after="40"/>
+            </w:pPr>
+            <w:r>
+              <w:rPr>
+                <w:b/>
+                <w:bCs/>
+              </w:rPr>
+              <w:t xml:space="preserve">A3-A</w:t>
+            </w:r>
+          </w:p>
+        </w:tc>
+        <w:tc>
+          <w:tcPr>
+            <w:tcW w:type="dxa" w:w="3250"/>
+            <w:tcBorders>
+              <w:top w:val="single" w:color="A6A6A6" w:sz="4"/>
+              <w:left w:val="single" w:color="A6A6A6" w:sz="4"/>
+              <w:bottom w:val="single" w:color="A6A6A6" w:sz="4"/>
+              <w:right w:val="single" w:color="A6A6A6" w:sz="4"/>
+            </w:tcBorders>
+            <w:tcMar>
+              <w:top w:type="dxa" w:w="60"/>
+              <w:left w:type="dxa" w:w="90"/>
+              <w:bottom w:type="dxa" w:w="60"/>
+              <w:right w:type="dxa" w:w="90"/>
+            </w:tcMar>
+          </w:tcPr>
+          <w:p>
+            <w:pPr>
+              <w:spacing w:after="40"/>
+            </w:pPr>
+            <m:oMath>
+              <m:f>
+                <m:num>
+                  <m:r>
+                    <m:t>x</m:t>
+                  </m:r>
+                </m:num>
+                <m:den>
+                  <m:sSup>
+                    <m:sSupPr/>
+                    <m:e>
+                      <m:r>
+                        <m:t>x</m:t>
+                      </m:r>
+                    </m:e>
+                    <m:sup>
+                      <m:r>
+                        <m:t>2</m:t>
+                      </m:r>
+                    </m:sup>
+                  </m:sSup>
+                  <m:r>
+                    <m:t>−4</m:t>
+                  </m:r>
+                </m:den>
+              </m:f>
+              <m:r>
+                <m:t>&lt;0</m:t>
+              </m:r>
+            </m:oMath>
+          </w:p>
+        </w:tc>
+        <w:tc>
+          <w:tcPr>
+            <w:tcW w:type="dxa" w:w="4200"/>
+            <w:tcBorders>
+              <w:top w:val="single" w:color="A6A6A6" w:sz="4"/>
+              <w:left w:val="single" w:color="A6A6A6" w:sz="4"/>
+              <w:bottom w:val="single" w:color="A6A6A6" w:sz="4"/>
+              <w:right w:val="single" w:color="A6A6A6" w:sz="4"/>
+            </w:tcBorders>
+            <w:tcMar>
+              <w:top w:type="dxa" w:w="60"/>
+              <w:left w:type="dxa" w:w="90"/>
+              <w:bottom w:type="dxa" w:w="60"/>
+              <w:right w:type="dxa" w:w="90"/>
+            </w:tcMar>
+          </w:tcPr>
+          <w:p>
+            <w:pPr>
+              <w:spacing w:after="40"/>
+            </w:pPr>
+            <m:oMath>
+              <m:r>
+                <m:t>x&lt;−2 ∨ 0&lt;x&lt;2</m:t>
+              </m:r>
+            </m:oMath>
+          </w:p>
+        </w:tc>
+        <w:tc>
+          <w:tcPr>
+            <w:tcW w:type="dxa" w:w="4900"/>
+            <w:tcBorders>
+              <w:top w:val="single" w:color="A6A6A6" w:sz="4"/>
+              <w:left w:val="single" w:color="A6A6A6" w:sz="4"/>
+              <w:bottom w:val="single" w:color="A6A6A6" w:sz="4"/>
+              <w:right w:val="single" w:color="A6A6A6" w:sz="4"/>
+            </w:tcBorders>
+            <w:tcMar>
+              <w:top w:type="dxa" w:w="60"/>
+              <w:left w:type="dxa" w:w="90"/>
+              <w:bottom w:type="dxa" w:w="60"/>
+              <w:right w:type="dxa" w:w="90"/>
+            </w:tcMar>
+          </w:tcPr>
+          <w:p>
+            <w:pPr>
+              <w:spacing w:after="40"/>
+            </w:pPr>
+            <w:r>
+              <w:rPr>
+                <w:b w:val="false"/>
+                <w:bCs w:val="false"/>
+              </w:rPr>
+              <w:t xml:space="preserve">N </w:t>
+            </w:r>
+            <w:r>
+              <w:rPr>
+                <w:b w:val="false"/>
+                <w:bCs w:val="false"/>
+              </w:rPr>
+              <w:t xml:space="preserve"> &gt;0 </w:t>
+            </w:r>
+            <w:r>
+              <w:rPr>
+                <w:b w:val="false"/>
+                <w:bCs w:val="false"/>
+              </w:rPr>
+              <w:t xml:space="preserve">: </w:t>
+            </w:r>
+            <m:oMath>
+              <m:r>
+                <m:t>x&gt;0</m:t>
+              </m:r>
+            </m:oMath>
+            <w:r>
+              <w:rPr>
+                <w:b w:val="false"/>
+                <w:bCs w:val="false"/>
+              </w:rPr>
+              <w:t xml:space="preserve">; D </w:t>
+            </w:r>
+            <w:r>
+              <w:rPr>
+                <w:b w:val="false"/>
+                <w:bCs w:val="false"/>
+              </w:rPr>
+              <w:t xml:space="preserve"> &gt;0 </w:t>
+            </w:r>
+            <w:r>
+              <w:rPr>
+                <w:b w:val="false"/>
+                <w:bCs w:val="false"/>
+              </w:rPr>
+              <w:t xml:space="preserve">: </w:t>
+            </w:r>
+            <m:oMath>
+              <m:r>
+                <m:t>x&lt;−2 ∨ x&gt;2</m:t>
+              </m:r>
+            </m:oMath>
+            <w:r>
+              <w:rPr>
+                <w:b w:val="false"/>
+                <w:bCs w:val="false"/>
+              </w:rPr>
+              <w:t xml:space="preserve">. Tabella con </w:t>
+            </w:r>
+            <m:oMath>
+              <m:r>
+                <m:t>−2</m:t>
+              </m:r>
+            </m:oMath>
+            <w:r>
+              <w:rPr>
+                <w:b w:val="false"/>
+                <w:bCs w:val="false"/>
+              </w:rPr>
+              <w:t xml:space="preserve">, </w:t>
+            </w:r>
+            <m:oMath>
+              <m:r>
+                <m:t>0</m:t>
+              </m:r>
+            </m:oMath>
+            <w:r>
+              <w:rPr>
+                <w:b w:val="false"/>
+                <w:bCs w:val="false"/>
+              </w:rPr>
+              <w:t xml:space="preserve">, </w:t>
+            </w:r>
+            <m:oMath>
+              <m:r>
+                <m:t>2</m:t>
+              </m:r>
+            </m:oMath>
+            <w:r>
+              <w:rPr>
+                <w:b w:val="false"/>
+                <w:bCs w:val="false"/>
+              </w:rPr>
+              <w:t xml:space="preserve">: segni −, +, −, +.  ★★★</w:t>
             </w:r>
           </w:p>
         </w:tc>
@@ -4573,7 +5146,7 @@
                 <w:b/>
                 <w:bCs/>
               </w:rPr>
-              <w:t xml:space="preserve">A1</w:t>
+              <w:t xml:space="preserve">A1-A</w:t>
             </w:r>
           </w:p>
         </w:tc>
@@ -5112,10 +5685,10 @@
             </w:pPr>
             <w:r>
               <w:rPr>
-                <w:b w:val="false"/>
-                <w:bCs w:val="false"/>
-              </w:rPr>
-              <w:t xml:space="preserve">—</w:t>
+                <w:b/>
+                <w:bCs/>
+              </w:rPr>
+              <w:t xml:space="preserve">A1-A</w:t>
             </w:r>
           </w:p>
         </w:tc>
@@ -5684,7 +6257,7 @@
                 <w:b/>
                 <w:bCs/>
               </w:rPr>
-              <w:t xml:space="preserve">A1</w:t>
+              <w:t xml:space="preserve">A1-A</w:t>
             </w:r>
           </w:p>
         </w:tc>
@@ -6745,10 +7318,10 @@
             </w:pPr>
             <w:r>
               <w:rPr>
-                <w:b w:val="false"/>
-                <w:bCs w:val="false"/>
-              </w:rPr>
-              <w:t xml:space="preserve">—</w:t>
+                <w:b/>
+                <w:bCs/>
+              </w:rPr>
+              <w:t xml:space="preserve">A1-A</w:t>
             </w:r>
           </w:p>
         </w:tc>
@@ -7317,7 +7890,7 @@
                 <w:b/>
                 <w:bCs/>
               </w:rPr>
-              <w:t xml:space="preserve">A1</w:t>
+              <w:t xml:space="preserve">A1-A</w:t>
             </w:r>
           </w:p>
         </w:tc>
@@ -7538,17 +8111,10 @@
             </w:pPr>
             <w:r>
               <w:rPr>
-                <w:b/>
-                <w:bCs/>
-              </w:rPr>
-              <w:t xml:space="preserve">A1</w:t>
-            </w:r>
-            <w:r>
-              <w:rPr>
-                <w:b w:val="false"/>
-                <w:bCs w:val="false"/>
-              </w:rPr>
-              <w:t xml:space="preserve">*</w:t>
+                <w:b w:val="false"/>
+                <w:bCs w:val="false"/>
+              </w:rPr>
+              <w:t xml:space="preserve">—</w:t>
             </w:r>
           </w:p>
         </w:tc>
@@ -8115,7 +8681,7 @@
                 <w:b/>
                 <w:bCs/>
               </w:rPr>
-              <w:t xml:space="preserve">A1</w:t>
+              <w:t xml:space="preserve">A3-B</w:t>
             </w:r>
           </w:p>
         </w:tc>
@@ -8529,10 +9095,10 @@
             </w:pPr>
             <w:r>
               <w:rPr>
-                <w:b w:val="false"/>
-                <w:bCs w:val="false"/>
-              </w:rPr>
-              <w:t xml:space="preserve">—</w:t>
+                <w:b/>
+                <w:bCs/>
+              </w:rPr>
+              <w:t xml:space="preserve">A3-B</w:t>
             </w:r>
           </w:p>
         </w:tc>
@@ -9259,7 +9825,7 @@
                 <w:b/>
                 <w:bCs/>
               </w:rPr>
-              <w:t xml:space="preserve">A1</w:t>
+              <w:t xml:space="preserve">A3-B</w:t>
             </w:r>
           </w:p>
         </w:tc>
@@ -9510,10 +10076,10 @@
             </w:pPr>
             <w:r>
               <w:rPr>
-                <w:b/>
-                <w:bCs/>
-              </w:rPr>
-              <w:t xml:space="preserve">A2</w:t>
+                <w:b w:val="false"/>
+                <w:bCs w:val="false"/>
+              </w:rPr>
+              <w:t xml:space="preserve">—</w:t>
             </w:r>
           </w:p>
         </w:tc>
@@ -9767,7 +10333,7 @@
                 <w:b/>
                 <w:bCs/>
               </w:rPr>
-              <w:t xml:space="preserve">A1</w:t>
+              <w:t xml:space="preserve">A3-B</w:t>
             </w:r>
           </w:p>
         </w:tc>
@@ -9970,10 +10536,10 @@
             </w:pPr>
             <w:r>
               <w:rPr>
-                <w:b w:val="false"/>
-                <w:bCs w:val="false"/>
-              </w:rPr>
-              <w:t xml:space="preserve">—</w:t>
+                <w:b/>
+                <w:bCs/>
+              </w:rPr>
+              <w:t xml:space="preserve">A3-B</w:t>
             </w:r>
           </w:p>
         </w:tc>
@@ -10195,7 +10761,7 @@
                 <w:b/>
                 <w:bCs/>
               </w:rPr>
-              <w:t xml:space="preserve">A1</w:t>
+              <w:t xml:space="preserve">A3</w:t>
             </w:r>
             <w:r>
               <w:rPr>
@@ -10685,7 +11251,7 @@
                 <w:b/>
                 <w:bCs/>
               </w:rPr>
-              <w:t xml:space="preserve">A2</w:t>
+              <w:t xml:space="preserve">A3-C</w:t>
             </w:r>
           </w:p>
         </w:tc>
@@ -11078,7 +11644,7 @@
                 <w:b/>
                 <w:bCs/>
               </w:rPr>
-              <w:t xml:space="preserve">A2</w:t>
+              <w:t xml:space="preserve">A3-C</w:t>
             </w:r>
           </w:p>
         </w:tc>
@@ -11294,7 +11860,7 @@
                 <w:b/>
                 <w:bCs/>
               </w:rPr>
-              <w:t xml:space="preserve">A2</w:t>
+              <w:t xml:space="preserve">A3-C</w:t>
             </w:r>
           </w:p>
         </w:tc>
@@ -11531,7 +12097,7 @@
                 <w:b/>
                 <w:bCs/>
               </w:rPr>
-              <w:t xml:space="preserve">A2</w:t>
+              <w:t xml:space="preserve">A3-C</w:t>
             </w:r>
           </w:p>
         </w:tc>
@@ -11768,7 +12334,7 @@
                 <w:b/>
                 <w:bCs/>
               </w:rPr>
-              <w:t xml:space="preserve">A2</w:t>
+              <w:t xml:space="preserve">A4-A</w:t>
             </w:r>
           </w:p>
         </w:tc>
@@ -11990,7 +12556,7 @@
                 <w:b/>
                 <w:bCs/>
               </w:rPr>
-              <w:t xml:space="preserve">A2</w:t>
+              <w:t xml:space="preserve">A3-C</w:t>
             </w:r>
           </w:p>
         </w:tc>
@@ -12254,10 +12820,10 @@
             </w:pPr>
             <w:r>
               <w:rPr>
-                <w:b w:val="false"/>
-                <w:bCs w:val="false"/>
-              </w:rPr>
-              <w:t xml:space="preserve">—</w:t>
+                <w:b/>
+                <w:bCs/>
+              </w:rPr>
+              <w:t xml:space="preserve">A4-A</w:t>
             </w:r>
           </w:p>
         </w:tc>
@@ -12733,7 +13299,7 @@
                 <w:b/>
                 <w:bCs/>
               </w:rPr>
-              <w:t xml:space="preserve">A2</w:t>
+              <w:t xml:space="preserve">A4-A</w:t>
             </w:r>
           </w:p>
         </w:tc>
@@ -13232,10 +13798,10 @@
             </w:pPr>
             <w:r>
               <w:rPr>
-                <w:b/>
-                <w:bCs/>
-              </w:rPr>
-              <w:t xml:space="preserve">A2</w:t>
+                <w:b w:val="false"/>
+                <w:bCs w:val="false"/>
+              </w:rPr>
+              <w:t xml:space="preserve">—</w:t>
             </w:r>
           </w:p>
         </w:tc>
@@ -14211,10 +14777,10 @@
             </w:pPr>
             <w:r>
               <w:rPr>
-                <w:b/>
-                <w:bCs/>
-              </w:rPr>
-              <w:t xml:space="preserve">A2</w:t>
+                <w:b w:val="false"/>
+                <w:bCs w:val="false"/>
+              </w:rPr>
+              <w:t xml:space="preserve">—</w:t>
             </w:r>
           </w:p>
         </w:tc>
@@ -14714,7 +15280,7 @@
                 <w:b/>
                 <w:bCs/>
               </w:rPr>
-              <w:t xml:space="preserve">A2</w:t>
+              <w:t xml:space="preserve">A4-A</w:t>
             </w:r>
           </w:p>
         </w:tc>
@@ -14934,7 +15500,7 @@
                 <w:b/>
                 <w:bCs/>
               </w:rPr>
-              <w:t xml:space="preserve">A2</w:t>
+              <w:t xml:space="preserve">A4-A</w:t>
             </w:r>
           </w:p>
         </w:tc>
@@ -15220,7 +15786,7 @@
                 <w:b/>
                 <w:bCs/>
               </w:rPr>
-              <w:t xml:space="preserve">A2</w:t>
+              <w:t xml:space="preserve">A4</w:t>
             </w:r>
             <w:r>
               <w:rPr>
@@ -15456,19 +16022,7 @@
                 <w:b w:val="false"/>
                 <w:bCs w:val="false"/>
               </w:rPr>
-              <w:t xml:space="preserve">: segni </w:t>
-            </w:r>
-            <m:oMath>
-              <m:r>
-                <m:t>−,+,−,+,−</m:t>
-              </m:r>
-            </m:oMath>
-            <w:r>
-              <w:rPr>
-                <w:b w:val="false"/>
-                <w:bCs w:val="false"/>
-              </w:rPr>
-              <w:t xml:space="preserve">.  ★★★</w:t>
+              <w:t xml:space="preserve">: segni −, +, −, +, −.  ★★★</w:t>
             </w:r>
           </w:p>
         </w:tc>
@@ -15558,17 +16112,10 @@
             </w:pPr>
             <w:r>
               <w:rPr>
-                <w:b/>
-                <w:bCs/>
-              </w:rPr>
-              <w:t xml:space="preserve">A2</w:t>
-            </w:r>
-            <w:r>
-              <w:rPr>
-                <w:b w:val="false"/>
-                <w:bCs w:val="false"/>
-              </w:rPr>
-              <w:t xml:space="preserve">*</w:t>
+                <w:b w:val="false"/>
+                <w:bCs w:val="false"/>
+              </w:rPr>
+              <w:t xml:space="preserve">—</w:t>
             </w:r>
           </w:p>
         </w:tc>
@@ -16080,7 +16627,7 @@
                 <w:b/>
                 <w:bCs/>
               </w:rPr>
-              <w:t xml:space="preserve">A3</w:t>
+              <w:t xml:space="preserve">A1-B</w:t>
             </w:r>
           </w:p>
         </w:tc>
@@ -16269,10 +16816,10 @@
             </w:pPr>
             <w:r>
               <w:rPr>
-                <w:b w:val="false"/>
-                <w:bCs w:val="false"/>
-              </w:rPr>
-              <w:t xml:space="preserve">—</w:t>
+                <w:b/>
+                <w:bCs/>
+              </w:rPr>
+              <w:t xml:space="preserve">A1-B</w:t>
             </w:r>
           </w:p>
         </w:tc>
@@ -16528,10 +17075,10 @@
             </w:pPr>
             <w:r>
               <w:rPr>
-                <w:b/>
-                <w:bCs/>
-              </w:rPr>
-              <w:t xml:space="preserve">A3</w:t>
+                <w:b w:val="false"/>
+                <w:bCs w:val="false"/>
+              </w:rPr>
+              <w:t xml:space="preserve">—</w:t>
             </w:r>
           </w:p>
         </w:tc>
@@ -17123,7 +17670,7 @@
                 <w:b/>
                 <w:bCs/>
               </w:rPr>
-              <w:t xml:space="preserve">A3</w:t>
+              <w:t xml:space="preserve">A1-B</w:t>
             </w:r>
           </w:p>
         </w:tc>
@@ -17363,7 +17910,7 @@
                 <w:b/>
                 <w:bCs/>
               </w:rPr>
-              <w:t xml:space="preserve">A3</w:t>
+              <w:t xml:space="preserve">A1-B</w:t>
             </w:r>
           </w:p>
         </w:tc>
@@ -18059,7 +18606,7 @@
                 <w:b/>
                 <w:bCs/>
               </w:rPr>
-              <w:t xml:space="preserve">A3</w:t>
+              <w:t xml:space="preserve">A1</w:t>
             </w:r>
             <w:r>
               <w:rPr>
@@ -18708,7 +19255,7 @@
                 <w:b/>
                 <w:bCs/>
               </w:rPr>
-              <w:t xml:space="preserve">A3</w:t>
+              <w:t xml:space="preserve">A4-B</w:t>
             </w:r>
           </w:p>
         </w:tc>
@@ -19030,7 +19577,7 @@
                 <w:b/>
                 <w:bCs/>
               </w:rPr>
-              <w:t xml:space="preserve">A3</w:t>
+              <w:t xml:space="preserve">A4-B</w:t>
             </w:r>
           </w:p>
         </w:tc>
@@ -20273,7 +20820,7 @@
                 <w:b/>
                 <w:bCs/>
               </w:rPr>
-              <w:t xml:space="preserve">A3</w:t>
+              <w:t xml:space="preserve">A4-B</w:t>
             </w:r>
           </w:p>
         </w:tc>
@@ -20546,17 +21093,10 @@
             </w:pPr>
             <w:r>
               <w:rPr>
-                <w:b/>
-                <w:bCs/>
-              </w:rPr>
-              <w:t xml:space="preserve">A3</w:t>
-            </w:r>
-            <w:r>
-              <w:rPr>
-                <w:b w:val="false"/>
-                <w:bCs w:val="false"/>
-              </w:rPr>
-              <w:t xml:space="preserve">*</w:t>
+                <w:b w:val="false"/>
+                <w:bCs w:val="false"/>
+              </w:rPr>
+              <w:t xml:space="preserve">—</w:t>
             </w:r>
           </w:p>
         </w:tc>
@@ -20908,7 +21448,7 @@
                 <w:b/>
                 <w:bCs/>
               </w:rPr>
-              <w:t xml:space="preserve">A3</w:t>
+              <w:t xml:space="preserve">A4-B</w:t>
             </w:r>
           </w:p>
         </w:tc>
@@ -22088,7 +22628,7 @@
                 <w:b/>
                 <w:bCs/>
               </w:rPr>
-              <w:t xml:space="preserve">A3</w:t>
+              <w:t xml:space="preserve">A1-C</w:t>
             </w:r>
           </w:p>
         </w:tc>
@@ -22308,10 +22848,10 @@
             </w:pPr>
             <w:r>
               <w:rPr>
-                <w:b w:val="false"/>
-                <w:bCs w:val="false"/>
-              </w:rPr>
-              <w:t xml:space="preserve">—</w:t>
+                <w:b/>
+                <w:bCs/>
+              </w:rPr>
+              <w:t xml:space="preserve">A1-C</w:t>
             </w:r>
           </w:p>
         </w:tc>
@@ -22527,10 +23067,10 @@
             </w:pPr>
             <w:r>
               <w:rPr>
-                <w:b/>
-                <w:bCs/>
-              </w:rPr>
-              <w:t xml:space="preserve">A3</w:t>
+                <w:b w:val="false"/>
+                <w:bCs w:val="false"/>
+              </w:rPr>
+              <w:t xml:space="preserve">—</w:t>
             </w:r>
           </w:p>
         </w:tc>
@@ -22757,10 +23297,10 @@
             </w:pPr>
             <w:r>
               <w:rPr>
-                <w:b w:val="false"/>
-                <w:bCs w:val="false"/>
-              </w:rPr>
-              <w:t xml:space="preserve">—</w:t>
+                <w:b/>
+                <w:bCs/>
+              </w:rPr>
+              <w:t xml:space="preserve">A1-C</w:t>
             </w:r>
           </w:p>
         </w:tc>
@@ -22994,10 +23534,10 @@
             </w:pPr>
             <w:r>
               <w:rPr>
-                <w:b/>
-                <w:bCs/>
-              </w:rPr>
-              <w:t xml:space="preserve">A3</w:t>
+                <w:b w:val="false"/>
+                <w:bCs w:val="false"/>
+              </w:rPr>
+              <w:t xml:space="preserve">—</w:t>
             </w:r>
           </w:p>
         </w:tc>
@@ -23317,10 +23857,10 @@
             </w:pPr>
             <w:r>
               <w:rPr>
-                <w:b w:val="false"/>
-                <w:bCs w:val="false"/>
-              </w:rPr>
-              <w:t xml:space="preserve">—</w:t>
+                <w:b/>
+                <w:bCs/>
+              </w:rPr>
+              <w:t xml:space="preserve">A1-C</w:t>
             </w:r>
           </w:p>
         </w:tc>
@@ -23752,10 +24292,10 @@
             </w:pPr>
             <w:r>
               <w:rPr>
-                <w:b/>
-                <w:bCs/>
-              </w:rPr>
-              <w:t xml:space="preserve">A3</w:t>
+                <w:b w:val="false"/>
+                <w:bCs w:val="false"/>
+              </w:rPr>
+              <w:t xml:space="preserve">—</w:t>
             </w:r>
           </w:p>
         </w:tc>
@@ -23973,10 +24513,10 @@
             </w:pPr>
             <w:r>
               <w:rPr>
-                <w:b w:val="false"/>
-                <w:bCs w:val="false"/>
-              </w:rPr>
-              <w:t xml:space="preserve">—</w:t>
+                <w:b/>
+                <w:bCs/>
+              </w:rPr>
+              <w:t xml:space="preserve">A1-C</w:t>
             </w:r>
           </w:p>
         </w:tc>
@@ -24209,17 +24749,10 @@
             </w:pPr>
             <w:r>
               <w:rPr>
-                <w:b/>
-                <w:bCs/>
-              </w:rPr>
-              <w:t xml:space="preserve">A3</w:t>
-            </w:r>
-            <w:r>
-              <w:rPr>
-                <w:b w:val="false"/>
-                <w:bCs w:val="false"/>
-              </w:rPr>
-              <w:t xml:space="preserve">*</w:t>
+                <w:b w:val="false"/>
+                <w:bCs w:val="false"/>
+              </w:rPr>
+              <w:t xml:space="preserve">—</w:t>
             </w:r>
           </w:p>
         </w:tc>
@@ -24753,7 +25286,7 @@
                 <w:b/>
                 <w:bCs/>
               </w:rPr>
-              <w:t xml:space="preserve">A4</w:t>
+              <w:t xml:space="preserve">A2-A</w:t>
             </w:r>
           </w:p>
         </w:tc>
@@ -25271,7 +25804,7 @@
                 <w:b/>
                 <w:bCs/>
               </w:rPr>
-              <w:t xml:space="preserve">A4</w:t>
+              <w:t xml:space="preserve">A2-A</w:t>
             </w:r>
           </w:p>
         </w:tc>
@@ -26282,7 +26815,7 @@
                 <w:b/>
                 <w:bCs/>
               </w:rPr>
-              <w:t xml:space="preserve">A4</w:t>
+              <w:t xml:space="preserve">A2-A</w:t>
             </w:r>
           </w:p>
         </w:tc>
@@ -26554,7 +27087,7 @@
                 <w:b/>
                 <w:bCs/>
               </w:rPr>
-              <w:t xml:space="preserve">A4</w:t>
+              <w:t xml:space="preserve">A2</w:t>
             </w:r>
             <w:r>
               <w:rPr>
@@ -27328,10 +27861,10 @@
             </w:pPr>
             <w:r>
               <w:rPr>
-                <w:b/>
-                <w:bCs/>
-              </w:rPr>
-              <w:t xml:space="preserve">A4</w:t>
+                <w:b w:val="false"/>
+                <w:bCs w:val="false"/>
+              </w:rPr>
+              <w:t xml:space="preserve">—</w:t>
             </w:r>
           </w:p>
         </w:tc>
@@ -28306,7 +28839,7 @@
                 <w:b/>
                 <w:bCs/>
               </w:rPr>
-              <w:t xml:space="preserve">A4</w:t>
+              <w:t xml:space="preserve">A2-B</w:t>
             </w:r>
           </w:p>
         </w:tc>
@@ -28521,10 +29054,10 @@
             </w:pPr>
             <w:r>
               <w:rPr>
-                <w:b/>
-                <w:bCs/>
-              </w:rPr>
-              <w:t xml:space="preserve">A4</w:t>
+                <w:b w:val="false"/>
+                <w:bCs w:val="false"/>
+              </w:rPr>
+              <w:t xml:space="preserve">—</w:t>
             </w:r>
           </w:p>
         </w:tc>
@@ -28766,10 +29299,10 @@
             </w:pPr>
             <w:r>
               <w:rPr>
-                <w:b w:val="false"/>
-                <w:bCs w:val="false"/>
-              </w:rPr>
-              <w:t xml:space="preserve">—</w:t>
+                <w:b/>
+                <w:bCs/>
+              </w:rPr>
+              <w:t xml:space="preserve">A2-B</w:t>
             </w:r>
           </w:p>
         </w:tc>
@@ -29552,7 +30085,7 @@
                 <w:b/>
                 <w:bCs/>
               </w:rPr>
-              <w:t xml:space="preserve">A4</w:t>
+              <w:t xml:space="preserve">A2-B</w:t>
             </w:r>
           </w:p>
         </w:tc>
@@ -29809,7 +30342,7 @@
                 <w:b/>
                 <w:bCs/>
               </w:rPr>
-              <w:t xml:space="preserve">A4</w:t>
+              <w:t xml:space="preserve">A2</w:t>
             </w:r>
             <w:r>
               <w:rPr>
@@ -31405,7 +31938,7 @@
                 <w:b/>
                 <w:bCs/>
               </w:rPr>
-              <w:t xml:space="preserve">A4</w:t>
+              <w:t xml:space="preserve">A4-C</w:t>
             </w:r>
           </w:p>
         </w:tc>
@@ -31699,7 +32232,7 @@
                 <w:b/>
                 <w:bCs/>
               </w:rPr>
-              <w:t xml:space="preserve">A4</w:t>
+              <w:t xml:space="preserve">A4-C</w:t>
             </w:r>
           </w:p>
         </w:tc>
@@ -32225,7 +32758,7 @@
                 <w:b/>
                 <w:bCs/>
               </w:rPr>
-              <w:t xml:space="preserve">A4</w:t>
+              <w:t xml:space="preserve">A4-C</w:t>
             </w:r>
           </w:p>
         </w:tc>
@@ -32960,7 +33493,7 @@
                 <w:b/>
                 <w:bCs/>
               </w:rPr>
-              <w:t xml:space="preserve">A4</w:t>
+              <w:t xml:space="preserve">A4-C</w:t>
             </w:r>
           </w:p>
         </w:tc>
@@ -33249,10 +33782,10 @@
             </w:pPr>
             <w:r>
               <w:rPr>
-                <w:b/>
-                <w:bCs/>
-              </w:rPr>
-              <w:t xml:space="preserve">A4</w:t>
+                <w:b w:val="false"/>
+                <w:bCs w:val="false"/>
+              </w:rPr>
+              <w:t xml:space="preserve">—</w:t>
             </w:r>
           </w:p>
         </w:tc>

</xml_diff>